<commit_message>
feat: enhance ND Pengantar PDI template and generation logic with QC columns handling
</commit_message>
<xml_diff>
--- a/diamond_web/fixtures/default_templates/nd_pengantar_pdi.docx
+++ b/diamond_web/fixtures/default_templates/nd_pengantar_pdi.docx
@@ -1473,18 +1473,36 @@
     <w:tbl>
       <w:tblPr>
         <w:tblStyle w:val="TableGrid"/>
-        <w:tblW w:w="9351" w:type="dxa"/>
+        <w:tblW w:w="14272" w:type="dxa"/>
         <w:tblLayout w:type="fixed"/>
+        <w:tblCellMar>
+          <w:left w:w="45" w:type="dxa"/>
+          <w:right w:w="45" w:type="dxa"/>
+        </w:tblCellMar>
         <w:tblLook w:val="04A0" w:firstRow="1" w:lastRow="0" w:firstColumn="1" w:lastColumn="0" w:noHBand="0" w:noVBand="1"/>
       </w:tblPr>
       <w:tblGrid>
-        <w:gridCol w:w="527"/>
-        <w:gridCol w:w="1453"/>
-        <w:gridCol w:w="1417"/>
-        <w:gridCol w:w="2127"/>
-        <w:gridCol w:w="1134"/>
-        <w:gridCol w:w="1134"/>
-        <w:gridCol w:w="1559"/>
+        <w:gridCol w:w="350"/>
+        <w:gridCol w:w="1150"/>
+        <w:gridCol w:w="1400"/>
+        <w:gridCol w:w="1250"/>
+        <w:gridCol w:w="1500"/>
+        <w:gridCol w:w="1000"/>
+        <w:gridCol w:w="1000"/>
+        <w:gridCol w:w="473"/>
+        <w:gridCol w:w="473"/>
+        <w:gridCol w:w="473"/>
+        <w:gridCol w:w="473"/>
+        <w:gridCol w:w="473"/>
+        <w:gridCol w:w="473"/>
+        <w:gridCol w:w="473"/>
+        <w:gridCol w:w="473"/>
+        <w:gridCol w:w="473"/>
+        <w:gridCol w:w="473"/>
+        <w:gridCol w:w="473"/>
+        <w:gridCol w:w="473"/>
+        <w:gridCol w:w="473"/>
+        <w:gridCol w:w="473"/>
       </w:tblGrid>
       <w:tr>
         <w:trPr>
@@ -1492,7 +1510,7 @@
         </w:trPr>
         <w:tc>
           <w:tcPr>
-            <w:tcW w:w="527" w:type="dxa"/>
+            <w:tcW w:w="350" w:type="dxa"/>
             <w:shd w:val="clear" w:color="auto" w:fill="BFBFBF" w:themeFill="background1" w:themeFillShade="BF"/>
             <w:vAlign w:val="center"/>
           </w:tcPr>
@@ -1504,6 +1522,8 @@
                 <w:b/>
                 <w:bCs/>
                 <w:color w:val="auto"/>
+                <w:sz w:val="16"/>
+                <w:szCs w:val="16"/>
               </w:rPr>
             </w:pPr>
             <w:r>
@@ -1511,6 +1531,9 @@
                 <w:rFonts w:eastAsia="Times New Roman" w:cs="Arial"/>
                 <w:b/>
                 <w:bCs/>
+                <w:lang w:val="en-US"/>
+                <w:sz w:val="16"/>
+                <w:szCs w:val="16"/>
               </w:rPr>
               <w:t>No</w:t>
             </w:r>
@@ -1518,7 +1541,7 @@
         </w:tc>
         <w:tc>
           <w:tcPr>
-            <w:tcW w:w="1453" w:type="dxa"/>
+            <w:tcW w:w="1150" w:type="dxa"/>
             <w:shd w:val="clear" w:color="auto" w:fill="BFBFBF" w:themeFill="background1" w:themeFillShade="BF"/>
             <w:vAlign w:val="center"/>
           </w:tcPr>
@@ -1530,6 +1553,8 @@
                 <w:b/>
                 <w:bCs/>
                 <w:color w:val="auto"/>
+                <w:sz w:val="16"/>
+                <w:szCs w:val="16"/>
               </w:rPr>
             </w:pPr>
             <w:r>
@@ -1538,14 +1563,16 @@
                 <w:b/>
                 <w:bCs/>
                 <w:lang w:val="en-US"/>
-              </w:rPr>
-              <w:t>Nomor Tiket</w:t>
-            </w:r>
-          </w:p>
-        </w:tc>
-        <w:tc>
-          <w:tcPr>
-            <w:tcW w:w="1417" w:type="dxa"/>
+                <w:sz w:val="16"/>
+                <w:szCs w:val="16"/>
+              </w:rPr>
+              <w:t>ILAP</w:t>
+            </w:r>
+          </w:p>
+        </w:tc>
+        <w:tc>
+          <w:tcPr>
+            <w:tcW w:w="1400" w:type="dxa"/>
             <w:shd w:val="clear" w:color="auto" w:fill="BFBFBF" w:themeFill="background1" w:themeFillShade="BF"/>
             <w:vAlign w:val="center"/>
           </w:tcPr>
@@ -1557,6 +1584,8 @@
                 <w:b/>
                 <w:bCs/>
                 <w:color w:val="auto"/>
+                <w:sz w:val="16"/>
+                <w:szCs w:val="16"/>
               </w:rPr>
             </w:pPr>
             <w:r>
@@ -1565,14 +1594,16 @@
                 <w:b/>
                 <w:bCs/>
                 <w:lang w:val="en-US"/>
-              </w:rPr>
-              <w:t>Sumber Data</w:t>
-            </w:r>
-          </w:p>
-        </w:tc>
-        <w:tc>
-          <w:tcPr>
-            <w:tcW w:w="2127" w:type="dxa"/>
+                <w:sz w:val="16"/>
+                <w:szCs w:val="16"/>
+              </w:rPr>
+              <w:t>Sub Jenis Data</w:t>
+            </w:r>
+          </w:p>
+        </w:tc>
+        <w:tc>
+          <w:tcPr>
+            <w:tcW w:w="1250" w:type="dxa"/>
             <w:shd w:val="clear" w:color="auto" w:fill="BFBFBF" w:themeFill="background1" w:themeFillShade="BF"/>
             <w:vAlign w:val="center"/>
           </w:tcPr>
@@ -1584,6 +1615,8 @@
                 <w:b/>
                 <w:bCs/>
                 <w:color w:val="auto"/>
+                <w:sz w:val="16"/>
+                <w:szCs w:val="16"/>
               </w:rPr>
             </w:pPr>
             <w:r>
@@ -1592,14 +1625,16 @@
                 <w:b/>
                 <w:bCs/>
                 <w:lang w:val="en-US"/>
-              </w:rPr>
-              <w:t>Jenis Data</w:t>
-            </w:r>
-          </w:p>
-        </w:tc>
-        <w:tc>
-          <w:tcPr>
-            <w:tcW w:w="1134" w:type="dxa"/>
+                <w:sz w:val="16"/>
+                <w:szCs w:val="16"/>
+              </w:rPr>
+              <w:t>Nomor Tiket</w:t>
+            </w:r>
+          </w:p>
+        </w:tc>
+        <w:tc>
+          <w:tcPr>
+            <w:tcW w:w="1500" w:type="dxa"/>
             <w:shd w:val="clear" w:color="auto" w:fill="BFBFBF" w:themeFill="background1" w:themeFillShade="BF"/>
             <w:vAlign w:val="center"/>
           </w:tcPr>
@@ -1611,6 +1646,8 @@
                 <w:b/>
                 <w:bCs/>
                 <w:color w:val="auto"/>
+                <w:sz w:val="16"/>
+                <w:szCs w:val="16"/>
               </w:rPr>
             </w:pPr>
             <w:r>
@@ -1619,14 +1656,16 @@
                 <w:b/>
                 <w:bCs/>
                 <w:lang w:val="en-US"/>
-              </w:rPr>
-              <w:t>Periode Data</w:t>
-            </w:r>
-          </w:p>
-        </w:tc>
-        <w:tc>
-          <w:tcPr>
-            <w:tcW w:w="1134" w:type="dxa"/>
+                <w:sz w:val="16"/>
+                <w:szCs w:val="16"/>
+              </w:rPr>
+              <w:t>Nama Tabel I</w:t>
+            </w:r>
+          </w:p>
+        </w:tc>
+        <w:tc>
+          <w:tcPr>
+            <w:tcW w:w="1000" w:type="dxa"/>
             <w:shd w:val="clear" w:color="auto" w:fill="BFBFBF" w:themeFill="background1" w:themeFillShade="BF"/>
             <w:vAlign w:val="center"/>
           </w:tcPr>
@@ -1638,6 +1677,8 @@
                 <w:b/>
                 <w:bCs/>
                 <w:color w:val="auto"/>
+                <w:sz w:val="16"/>
+                <w:szCs w:val="16"/>
               </w:rPr>
             </w:pPr>
             <w:r>
@@ -1646,14 +1687,16 @@
                 <w:b/>
                 <w:bCs/>
                 <w:lang w:val="en-US"/>
-              </w:rPr>
-              <w:t>Jumlah Baris Data</w:t>
-            </w:r>
-          </w:p>
-        </w:tc>
-        <w:tc>
-          <w:tcPr>
-            <w:tcW w:w="1559" w:type="dxa"/>
+                <w:sz w:val="16"/>
+                <w:szCs w:val="16"/>
+              </w:rPr>
+              <w:t>Baris Lengkap</w:t>
+            </w:r>
+          </w:p>
+        </w:tc>
+        <w:tc>
+          <w:tcPr>
+            <w:tcW w:w="1000" w:type="dxa"/>
             <w:shd w:val="clear" w:color="auto" w:fill="BFBFBF" w:themeFill="background1" w:themeFillShade="BF"/>
             <w:vAlign w:val="center"/>
           </w:tcPr>
@@ -1665,6 +1708,8 @@
                 <w:b/>
                 <w:bCs/>
                 <w:color w:val="auto"/>
+                <w:sz w:val="16"/>
+                <w:szCs w:val="16"/>
               </w:rPr>
             </w:pPr>
             <w:r>
@@ -1673,8 +1718,444 @@
                 <w:b/>
                 <w:bCs/>
                 <w:lang w:val="en-US"/>
-              </w:rPr>
-              <w:t>Ket</w:t>
+                <w:sz w:val="16"/>
+                <w:szCs w:val="16"/>
+              </w:rPr>
+              <w:t>Baris I</w:t>
+            </w:r>
+          </w:p>
+        </w:tc>
+        <w:tc>
+          <w:tcPr>
+            <w:tcW w:w="473" w:type="dxa"/>
+            <w:shd w:val="clear" w:color="auto" w:fill="BFBFBF" w:themeFill="background1" w:themeFillShade="BF"/>
+            <w:vAlign w:val="center"/>
+          </w:tcPr>
+          <w:p>
+            <w:pPr>
+              <w:jc w:val="center"/>
+              <w:rPr>
+                <w:rFonts w:cs="Arial"/>
+                <w:b/>
+                <w:bCs/>
+                <w:color w:val="auto"/>
+                <w:sz w:val="16"/>
+                <w:szCs w:val="16"/>
+              </w:rPr>
+            </w:pPr>
+            <w:r>
+              <w:rPr>
+                <w:rFonts w:eastAsia="Times New Roman" w:cs="Arial"/>
+                <w:b/>
+                <w:bCs/>
+                <w:lang w:val="en-US"/>
+                <w:sz w:val="16"/>
+                <w:szCs w:val="16"/>
+              </w:rPr>
+              <w:t>QC P</w:t>
+            </w:r>
+          </w:p>
+        </w:tc>
+        <w:tc>
+          <w:tcPr>
+            <w:tcW w:w="473" w:type="dxa"/>
+            <w:shd w:val="clear" w:color="auto" w:fill="BFBFBF" w:themeFill="background1" w:themeFillShade="BF"/>
+            <w:vAlign w:val="center"/>
+          </w:tcPr>
+          <w:p>
+            <w:pPr>
+              <w:jc w:val="center"/>
+              <w:rPr>
+                <w:rFonts w:cs="Arial"/>
+                <w:b/>
+                <w:bCs/>
+                <w:color w:val="auto"/>
+                <w:sz w:val="16"/>
+                <w:szCs w:val="16"/>
+              </w:rPr>
+            </w:pPr>
+            <w:r>
+              <w:rPr>
+                <w:rFonts w:eastAsia="Times New Roman" w:cs="Arial"/>
+                <w:b/>
+                <w:bCs/>
+                <w:lang w:val="en-US"/>
+                <w:sz w:val="16"/>
+                <w:szCs w:val="16"/>
+              </w:rPr>
+              <w:t>QC X</w:t>
+            </w:r>
+          </w:p>
+        </w:tc>
+        <w:tc>
+          <w:tcPr>
+            <w:tcW w:w="473" w:type="dxa"/>
+            <w:shd w:val="clear" w:color="auto" w:fill="BFBFBF" w:themeFill="background1" w:themeFillShade="BF"/>
+            <w:vAlign w:val="center"/>
+          </w:tcPr>
+          <w:p>
+            <w:pPr>
+              <w:jc w:val="center"/>
+              <w:rPr>
+                <w:rFonts w:cs="Arial"/>
+                <w:b/>
+                <w:bCs/>
+                <w:color w:val="auto"/>
+                <w:sz w:val="16"/>
+                <w:szCs w:val="16"/>
+              </w:rPr>
+            </w:pPr>
+            <w:r>
+              <w:rPr>
+                <w:rFonts w:eastAsia="Times New Roman" w:cs="Arial"/>
+                <w:b/>
+                <w:bCs/>
+                <w:lang w:val="en-US"/>
+                <w:sz w:val="16"/>
+                <w:szCs w:val="16"/>
+              </w:rPr>
+              <w:t>QC W</w:t>
+            </w:r>
+          </w:p>
+        </w:tc>
+        <w:tc>
+          <w:tcPr>
+            <w:tcW w:w="473" w:type="dxa"/>
+            <w:shd w:val="clear" w:color="auto" w:fill="BFBFBF" w:themeFill="background1" w:themeFillShade="BF"/>
+            <w:vAlign w:val="center"/>
+          </w:tcPr>
+          <w:p>
+            <w:pPr>
+              <w:jc w:val="center"/>
+              <w:rPr>
+                <w:rFonts w:cs="Arial"/>
+                <w:b/>
+                <w:bCs/>
+                <w:color w:val="auto"/>
+                <w:sz w:val="16"/>
+                <w:szCs w:val="16"/>
+              </w:rPr>
+            </w:pPr>
+            <w:r>
+              <w:rPr>
+                <w:rFonts w:eastAsia="Times New Roman" w:cs="Arial"/>
+                <w:b/>
+                <w:bCs/>
+                <w:lang w:val="en-US"/>
+                <w:sz w:val="16"/>
+                <w:szCs w:val="16"/>
+              </w:rPr>
+              <w:t>QC F</w:t>
+            </w:r>
+          </w:p>
+        </w:tc>
+        <w:tc>
+          <w:tcPr>
+            <w:tcW w:w="473" w:type="dxa"/>
+            <w:shd w:val="clear" w:color="auto" w:fill="BFBFBF" w:themeFill="background1" w:themeFillShade="BF"/>
+            <w:vAlign w:val="center"/>
+          </w:tcPr>
+          <w:p>
+            <w:pPr>
+              <w:jc w:val="center"/>
+              <w:rPr>
+                <w:rFonts w:cs="Arial"/>
+                <w:b/>
+                <w:bCs/>
+                <w:color w:val="auto"/>
+                <w:sz w:val="16"/>
+                <w:szCs w:val="16"/>
+              </w:rPr>
+            </w:pPr>
+            <w:r>
+              <w:rPr>
+                <w:rFonts w:eastAsia="Times New Roman" w:cs="Arial"/>
+                <w:b/>
+                <w:bCs/>
+                <w:lang w:val="en-US"/>
+                <w:sz w:val="16"/>
+                <w:szCs w:val="16"/>
+              </w:rPr>
+              <w:t>QC A</w:t>
+            </w:r>
+          </w:p>
+        </w:tc>
+        <w:tc>
+          <w:tcPr>
+            <w:tcW w:w="473" w:type="dxa"/>
+            <w:shd w:val="clear" w:color="auto" w:fill="BFBFBF" w:themeFill="background1" w:themeFillShade="BF"/>
+            <w:vAlign w:val="center"/>
+          </w:tcPr>
+          <w:p>
+            <w:pPr>
+              <w:jc w:val="center"/>
+              <w:rPr>
+                <w:rFonts w:cs="Arial"/>
+                <w:b/>
+                <w:bCs/>
+                <w:color w:val="auto"/>
+                <w:sz w:val="16"/>
+                <w:szCs w:val="16"/>
+              </w:rPr>
+            </w:pPr>
+            <w:r>
+              <w:rPr>
+                <w:rFonts w:eastAsia="Times New Roman" w:cs="Arial"/>
+                <w:b/>
+                <w:bCs/>
+                <w:lang w:val="en-US"/>
+                <w:sz w:val="16"/>
+                <w:szCs w:val="16"/>
+              </w:rPr>
+              <w:t>QC C</w:t>
+            </w:r>
+          </w:p>
+        </w:tc>
+        <w:tc>
+          <w:tcPr>
+            <w:tcW w:w="473" w:type="dxa"/>
+            <w:shd w:val="clear" w:color="auto" w:fill="BFBFBF" w:themeFill="background1" w:themeFillShade="BF"/>
+            <w:vAlign w:val="center"/>
+          </w:tcPr>
+          <w:p>
+            <w:pPr>
+              <w:jc w:val="center"/>
+              <w:rPr>
+                <w:rFonts w:cs="Arial"/>
+                <w:b/>
+                <w:bCs/>
+                <w:color w:val="auto"/>
+                <w:sz w:val="16"/>
+                <w:szCs w:val="16"/>
+              </w:rPr>
+            </w:pPr>
+            <w:r>
+              <w:rPr>
+                <w:rFonts w:eastAsia="Times New Roman" w:cs="Arial"/>
+                <w:b/>
+                <w:bCs/>
+                <w:lang w:val="en-US"/>
+                <w:sz w:val="16"/>
+                <w:szCs w:val="16"/>
+              </w:rPr>
+              <w:t>QC N</w:t>
+            </w:r>
+          </w:p>
+        </w:tc>
+        <w:tc>
+          <w:tcPr>
+            <w:tcW w:w="473" w:type="dxa"/>
+            <w:shd w:val="clear" w:color="auto" w:fill="BFBFBF" w:themeFill="background1" w:themeFillShade="BF"/>
+            <w:vAlign w:val="center"/>
+          </w:tcPr>
+          <w:p>
+            <w:pPr>
+              <w:jc w:val="center"/>
+              <w:rPr>
+                <w:rFonts w:cs="Arial"/>
+                <w:b/>
+                <w:bCs/>
+                <w:color w:val="auto"/>
+                <w:sz w:val="16"/>
+                <w:szCs w:val="16"/>
+              </w:rPr>
+            </w:pPr>
+            <w:r>
+              <w:rPr>
+                <w:rFonts w:eastAsia="Times New Roman" w:cs="Arial"/>
+                <w:b/>
+                <w:bCs/>
+                <w:lang w:val="en-US"/>
+                <w:sz w:val="16"/>
+                <w:szCs w:val="16"/>
+              </w:rPr>
+              <w:t>QC Y</w:t>
+            </w:r>
+          </w:p>
+        </w:tc>
+        <w:tc>
+          <w:tcPr>
+            <w:tcW w:w="473" w:type="dxa"/>
+            <w:shd w:val="clear" w:color="auto" w:fill="BFBFBF" w:themeFill="background1" w:themeFillShade="BF"/>
+            <w:vAlign w:val="center"/>
+          </w:tcPr>
+          <w:p>
+            <w:pPr>
+              <w:jc w:val="center"/>
+              <w:rPr>
+                <w:rFonts w:cs="Arial"/>
+                <w:b/>
+                <w:bCs/>
+                <w:color w:val="auto"/>
+                <w:sz w:val="16"/>
+                <w:szCs w:val="16"/>
+              </w:rPr>
+            </w:pPr>
+            <w:r>
+              <w:rPr>
+                <w:rFonts w:eastAsia="Times New Roman" w:cs="Arial"/>
+                <w:b/>
+                <w:bCs/>
+                <w:lang w:val="en-US"/>
+                <w:sz w:val="16"/>
+                <w:szCs w:val="16"/>
+              </w:rPr>
+              <w:t>QC Z</w:t>
+            </w:r>
+          </w:p>
+        </w:tc>
+        <w:tc>
+          <w:tcPr>
+            <w:tcW w:w="473" w:type="dxa"/>
+            <w:shd w:val="clear" w:color="auto" w:fill="BFBFBF" w:themeFill="background1" w:themeFillShade="BF"/>
+            <w:vAlign w:val="center"/>
+          </w:tcPr>
+          <w:p>
+            <w:pPr>
+              <w:jc w:val="center"/>
+              <w:rPr>
+                <w:rFonts w:cs="Arial"/>
+                <w:b/>
+                <w:bCs/>
+                <w:color w:val="auto"/>
+                <w:sz w:val="16"/>
+                <w:szCs w:val="16"/>
+              </w:rPr>
+            </w:pPr>
+            <w:r>
+              <w:rPr>
+                <w:rFonts w:eastAsia="Times New Roman" w:cs="Arial"/>
+                <w:b/>
+                <w:bCs/>
+                <w:lang w:val="en-US"/>
+                <w:sz w:val="16"/>
+                <w:szCs w:val="16"/>
+              </w:rPr>
+              <w:t>QC U</w:t>
+            </w:r>
+          </w:p>
+        </w:tc>
+        <w:tc>
+          <w:tcPr>
+            <w:tcW w:w="473" w:type="dxa"/>
+            <w:shd w:val="clear" w:color="auto" w:fill="BFBFBF" w:themeFill="background1" w:themeFillShade="BF"/>
+            <w:vAlign w:val="center"/>
+          </w:tcPr>
+          <w:p>
+            <w:pPr>
+              <w:jc w:val="center"/>
+              <w:rPr>
+                <w:rFonts w:cs="Arial"/>
+                <w:b/>
+                <w:bCs/>
+                <w:color w:val="auto"/>
+                <w:sz w:val="16"/>
+                <w:szCs w:val="16"/>
+              </w:rPr>
+            </w:pPr>
+            <w:r>
+              <w:rPr>
+                <w:rFonts w:eastAsia="Times New Roman" w:cs="Arial"/>
+                <w:b/>
+                <w:bCs/>
+                <w:lang w:val="en-US"/>
+                <w:sz w:val="16"/>
+                <w:szCs w:val="16"/>
+              </w:rPr>
+              <w:t>QC E</w:t>
+            </w:r>
+          </w:p>
+        </w:tc>
+        <w:tc>
+          <w:tcPr>
+            <w:tcW w:w="473" w:type="dxa"/>
+            <w:shd w:val="clear" w:color="auto" w:fill="BFBFBF" w:themeFill="background1" w:themeFillShade="BF"/>
+            <w:vAlign w:val="center"/>
+          </w:tcPr>
+          <w:p>
+            <w:pPr>
+              <w:jc w:val="center"/>
+              <w:rPr>
+                <w:rFonts w:cs="Arial"/>
+                <w:b/>
+                <w:bCs/>
+                <w:color w:val="auto"/>
+                <w:sz w:val="16"/>
+                <w:szCs w:val="16"/>
+              </w:rPr>
+            </w:pPr>
+            <w:r>
+              <w:rPr>
+                <w:rFonts w:eastAsia="Times New Roman" w:cs="Arial"/>
+                <w:b/>
+                <w:bCs/>
+                <w:lang w:val="en-US"/>
+                <w:sz w:val="16"/>
+                <w:szCs w:val="16"/>
+              </w:rPr>
+              <w:t>QC V</w:t>
+            </w:r>
+          </w:p>
+        </w:tc>
+        <w:tc>
+          <w:tcPr>
+            <w:tcW w:w="473" w:type="dxa"/>
+            <w:shd w:val="clear" w:color="auto" w:fill="BFBFBF" w:themeFill="background1" w:themeFillShade="BF"/>
+            <w:vAlign w:val="center"/>
+          </w:tcPr>
+          <w:p>
+            <w:pPr>
+              <w:jc w:val="center"/>
+              <w:rPr>
+                <w:rFonts w:cs="Arial"/>
+                <w:b/>
+                <w:bCs/>
+                <w:color w:val="auto"/>
+                <w:sz w:val="16"/>
+                <w:szCs w:val="16"/>
+              </w:rPr>
+            </w:pPr>
+            <w:r>
+              <w:rPr>
+                <w:rFonts w:eastAsia="Times New Roman" w:cs="Arial"/>
+                <w:b/>
+                <w:bCs/>
+                <w:lang w:val="en-US"/>
+                <w:sz w:val="16"/>
+                <w:szCs w:val="16"/>
+              </w:rPr>
+              <w:t>QC R</w:t>
+            </w:r>
+          </w:p>
+        </w:tc>
+        <w:tc>
+          <w:tcPr>
+            <w:tcW w:w="473" w:type="dxa"/>
+            <w:shd w:val="clear" w:color="auto" w:fill="BFBFBF" w:themeFill="background1" w:themeFillShade="BF"/>
+            <w:vAlign w:val="center"/>
+          </w:tcPr>
+          <w:p>
+            <w:pPr>
+              <w:jc w:val="center"/>
+              <w:rPr>
+                <w:rFonts w:cs="Arial"/>
+                <w:b/>
+                <w:bCs/>
+                <w:color w:val="auto"/>
+                <w:sz w:val="16"/>
+                <w:szCs w:val="16"/>
+              </w:rPr>
+            </w:pPr>
+            <w:r>
+              <w:rPr>
+                <w:rFonts w:eastAsia="Times New Roman" w:cs="Arial"/>
+                <w:b/>
+                <w:bCs/>
+                <w:lang w:val="en-US"/>
+                <w:sz w:val="16"/>
+                <w:szCs w:val="16"/>
+              </w:rPr>
+              <w:t>QC D</w:t>
             </w:r>
           </w:p>
         </w:tc>
@@ -1682,28 +2163,7 @@
       <w:tr>
         <w:tc>
           <w:tcPr>
-            <w:tcW w:w="527" w:type="dxa"/>
-            <w:vAlign w:val="center"/>
-          </w:tcPr>
-          <w:p>
-            <w:pPr>
-              <w:jc w:val="center"/>
-              <w:rPr>
-                <w:rFonts w:cs="Arial"/>
-                <w:lang w:val="en-US"/>
-              </w:rPr>
-            </w:pPr>
-            <w:r>
-              <w:rPr>
-                <w:sz w:val="24"/>
-              </w:rPr>
-              <w:t>{{row.nomor}}</w:t>
-            </w:r>
-          </w:p>
-        </w:tc>
-        <w:tc>
-          <w:tcPr>
-            <w:tcW w:w="1453" w:type="dxa"/>
+            <w:tcW w:w="350" w:type="dxa"/>
             <w:vAlign w:val="center"/>
           </w:tcPr>
           <w:p>
@@ -1712,108 +2172,496 @@
                 <w:rFonts w:cs="Arial"/>
                 <w:highlight w:val="yellow"/>
                 <w:lang w:val="en-US"/>
-              </w:rPr>
-            </w:pPr>
-            <w:r>
-              <w:rPr/>
+                <w:sz w:val="16"/>
+                <w:szCs w:val="16"/>
+              </w:rPr>
+            </w:pPr>
+            <w:r>
+              <w:rPr>
+                <w:sz w:val="16"/>
+                <w:szCs w:val="16"/>
+              </w:rPr>
+              <w:t>{{row.nomor}}</w:t>
+            </w:r>
+          </w:p>
+        </w:tc>
+        <w:tc>
+          <w:tcPr>
+            <w:tcW w:w="1150" w:type="dxa"/>
+            <w:vAlign w:val="center"/>
+          </w:tcPr>
+          <w:p>
+            <w:pPr>
+              <w:rPr>
+                <w:rFonts w:cs="Arial"/>
+                <w:highlight w:val="yellow"/>
+                <w:lang w:val="en-US"/>
+                <w:sz w:val="16"/>
+                <w:szCs w:val="16"/>
+              </w:rPr>
+            </w:pPr>
+            <w:r>
+              <w:rPr>
+                <w:sz w:val="16"/>
+                <w:szCs w:val="16"/>
+              </w:rPr>
+              <w:t>{{row.ilap}}</w:t>
+            </w:r>
+          </w:p>
+        </w:tc>
+        <w:tc>
+          <w:tcPr>
+            <w:tcW w:w="1400" w:type="dxa"/>
+            <w:vAlign w:val="center"/>
+          </w:tcPr>
+          <w:p>
+            <w:pPr>
+              <w:rPr>
+                <w:rFonts w:cs="Arial"/>
+                <w:highlight w:val="yellow"/>
+                <w:lang w:val="en-US"/>
+                <w:sz w:val="16"/>
+                <w:szCs w:val="16"/>
+              </w:rPr>
+            </w:pPr>
+            <w:r>
+              <w:rPr>
+                <w:sz w:val="16"/>
+                <w:szCs w:val="16"/>
+              </w:rPr>
+              <w:t>{{row.sub_jenis_data}}</w:t>
+            </w:r>
+          </w:p>
+        </w:tc>
+        <w:tc>
+          <w:tcPr>
+            <w:tcW w:w="1250" w:type="dxa"/>
+            <w:vAlign w:val="center"/>
+          </w:tcPr>
+          <w:p>
+            <w:pPr>
+              <w:rPr>
+                <w:rFonts w:cs="Arial"/>
+                <w:highlight w:val="yellow"/>
+                <w:lang w:val="en-US"/>
+                <w:sz w:val="16"/>
+                <w:szCs w:val="16"/>
+              </w:rPr>
+            </w:pPr>
+            <w:r>
+              <w:rPr>
+                <w:sz w:val="16"/>
+                <w:szCs w:val="16"/>
+              </w:rPr>
               <w:t>{{row.nomor_tiket}}</w:t>
             </w:r>
           </w:p>
         </w:tc>
         <w:tc>
           <w:tcPr>
-            <w:tcW w:w="1417" w:type="dxa"/>
+            <w:tcW w:w="1500" w:type="dxa"/>
             <w:vAlign w:val="center"/>
           </w:tcPr>
           <w:p>
             <w:pPr>
               <w:rPr>
                 <w:rFonts w:cs="Arial"/>
-              </w:rPr>
-            </w:pPr>
-            <w:r>
-              <w:rPr/>
-              <w:t>{{row.nama_ilap}}</w:t>
-            </w:r>
-          </w:p>
-        </w:tc>
-        <w:tc>
-          <w:tcPr>
-            <w:tcW w:w="2127" w:type="dxa"/>
+                <w:highlight w:val="yellow"/>
+                <w:lang w:val="en-US"/>
+                <w:sz w:val="16"/>
+                <w:szCs w:val="16"/>
+              </w:rPr>
+            </w:pPr>
+            <w:r>
+              <w:rPr>
+                <w:sz w:val="16"/>
+                <w:szCs w:val="16"/>
+              </w:rPr>
+              <w:t>{{row.nama_tabel_i}}</w:t>
+            </w:r>
+          </w:p>
+        </w:tc>
+        <w:tc>
+          <w:tcPr>
+            <w:tcW w:w="1000" w:type="dxa"/>
             <w:vAlign w:val="center"/>
           </w:tcPr>
           <w:p>
             <w:pPr>
               <w:rPr>
-                <w:rFonts w:eastAsia="Times New Roman" w:cs="Arial"/>
-                <w:color w:val="auto"/>
+                <w:rFonts w:cs="Arial"/>
                 <w:highlight w:val="yellow"/>
-                <w:lang w:val="en-US" w:eastAsia="en-ID"/>
-              </w:rPr>
-            </w:pPr>
-            <w:r>
-              <w:rPr/>
-              <w:t>{{row.sub_jenis_data}}</w:t>
-            </w:r>
-          </w:p>
-        </w:tc>
-        <w:tc>
-          <w:tcPr>
-            <w:tcW w:w="1134" w:type="dxa"/>
+                <w:lang w:val="en-US"/>
+                <w:sz w:val="16"/>
+                <w:szCs w:val="16"/>
+              </w:rPr>
+            </w:pPr>
+            <w:r>
+              <w:rPr>
+                <w:sz w:val="16"/>
+                <w:szCs w:val="16"/>
+              </w:rPr>
+              <w:t>{{row.baris_lengkap}}</w:t>
+            </w:r>
+          </w:p>
+        </w:tc>
+        <w:tc>
+          <w:tcPr>
+            <w:tcW w:w="1000" w:type="dxa"/>
             <w:vAlign w:val="center"/>
           </w:tcPr>
           <w:p>
             <w:pPr>
-              <w:jc w:val="center"/>
-              <w:rPr>
-                <w:rFonts w:eastAsia="Times New Roman" w:cs="Arial"/>
+              <w:rPr>
+                <w:rFonts w:cs="Arial"/>
                 <w:highlight w:val="yellow"/>
-                <w:lang w:val="en-US" w:eastAsia="en-ID"/>
-              </w:rPr>
-            </w:pPr>
-            <w:r>
-              <w:rPr>
-                <w:sz w:val="24"/>
-              </w:rPr>
-              <w:t>{{row.periode_data}}</w:t>
-            </w:r>
-          </w:p>
-        </w:tc>
-        <w:tc>
-          <w:tcPr>
-            <w:tcW w:w="1134" w:type="dxa"/>
+                <w:lang w:val="en-US"/>
+                <w:sz w:val="16"/>
+                <w:szCs w:val="16"/>
+              </w:rPr>
+            </w:pPr>
+            <w:r>
+              <w:rPr>
+                <w:sz w:val="16"/>
+                <w:szCs w:val="16"/>
+              </w:rPr>
+              <w:t>{{row.baris_i}}</w:t>
+            </w:r>
+          </w:p>
+        </w:tc>
+        <w:tc>
+          <w:tcPr>
+            <w:tcW w:w="473" w:type="dxa"/>
             <w:vAlign w:val="center"/>
           </w:tcPr>
           <w:p>
             <w:pPr>
-              <w:jc w:val="center"/>
               <w:rPr>
                 <w:rFonts w:cs="Arial"/>
-                <w:lang w:val="en-US"/>
-              </w:rPr>
-            </w:pPr>
-            <w:r>
-              <w:rPr/>
-              <w:t>{{row.jumlah_baris_lengkap}}</w:t>
-            </w:r>
-          </w:p>
-        </w:tc>
-        <w:tc>
-          <w:tcPr>
-            <w:tcW w:w="1559" w:type="dxa"/>
+                <w:highlight w:val="yellow"/>
+                <w:lang w:val="en-US"/>
+                <w:sz w:val="16"/>
+                <w:szCs w:val="16"/>
+              </w:rPr>
+            </w:pPr>
+            <w:r>
+              <w:rPr>
+                <w:sz w:val="16"/>
+                <w:szCs w:val="16"/>
+              </w:rPr>
+              <w:t>{{row.qc_p}}</w:t>
+            </w:r>
+          </w:p>
+        </w:tc>
+        <w:tc>
+          <w:tcPr>
+            <w:tcW w:w="473" w:type="dxa"/>
             <w:vAlign w:val="center"/>
           </w:tcPr>
           <w:p>
             <w:pPr>
               <w:rPr>
                 <w:rFonts w:cs="Arial"/>
-                <w:color w:val="auto"/>
-                <w:lang w:val="en-US"/>
-              </w:rPr>
-            </w:pPr>
-            <w:r>
-              <w:rPr/>
-              <w:t>{{row.nama_tabel_i}}</w:t>
+                <w:highlight w:val="yellow"/>
+                <w:lang w:val="en-US"/>
+                <w:sz w:val="16"/>
+                <w:szCs w:val="16"/>
+              </w:rPr>
+            </w:pPr>
+            <w:r>
+              <w:rPr>
+                <w:sz w:val="16"/>
+                <w:szCs w:val="16"/>
+              </w:rPr>
+              <w:t>{{row.qc_x}}</w:t>
+            </w:r>
+          </w:p>
+        </w:tc>
+        <w:tc>
+          <w:tcPr>
+            <w:tcW w:w="473" w:type="dxa"/>
+            <w:vAlign w:val="center"/>
+          </w:tcPr>
+          <w:p>
+            <w:pPr>
+              <w:rPr>
+                <w:rFonts w:cs="Arial"/>
+                <w:highlight w:val="yellow"/>
+                <w:lang w:val="en-US"/>
+                <w:sz w:val="16"/>
+                <w:szCs w:val="16"/>
+              </w:rPr>
+            </w:pPr>
+            <w:r>
+              <w:rPr>
+                <w:sz w:val="16"/>
+                <w:szCs w:val="16"/>
+              </w:rPr>
+              <w:t>{{row.qc_w}}</w:t>
+            </w:r>
+          </w:p>
+        </w:tc>
+        <w:tc>
+          <w:tcPr>
+            <w:tcW w:w="473" w:type="dxa"/>
+            <w:vAlign w:val="center"/>
+          </w:tcPr>
+          <w:p>
+            <w:pPr>
+              <w:rPr>
+                <w:rFonts w:cs="Arial"/>
+                <w:highlight w:val="yellow"/>
+                <w:lang w:val="en-US"/>
+                <w:sz w:val="16"/>
+                <w:szCs w:val="16"/>
+              </w:rPr>
+            </w:pPr>
+            <w:r>
+              <w:rPr>
+                <w:sz w:val="16"/>
+                <w:szCs w:val="16"/>
+              </w:rPr>
+              <w:t>{{row.qc_f}}</w:t>
+            </w:r>
+          </w:p>
+        </w:tc>
+        <w:tc>
+          <w:tcPr>
+            <w:tcW w:w="473" w:type="dxa"/>
+            <w:vAlign w:val="center"/>
+          </w:tcPr>
+          <w:p>
+            <w:pPr>
+              <w:rPr>
+                <w:rFonts w:cs="Arial"/>
+                <w:highlight w:val="yellow"/>
+                <w:lang w:val="en-US"/>
+                <w:sz w:val="16"/>
+                <w:szCs w:val="16"/>
+              </w:rPr>
+            </w:pPr>
+            <w:r>
+              <w:rPr>
+                <w:sz w:val="16"/>
+                <w:szCs w:val="16"/>
+              </w:rPr>
+              <w:t>{{row.qc_a}}</w:t>
+            </w:r>
+          </w:p>
+        </w:tc>
+        <w:tc>
+          <w:tcPr>
+            <w:tcW w:w="473" w:type="dxa"/>
+            <w:vAlign w:val="center"/>
+          </w:tcPr>
+          <w:p>
+            <w:pPr>
+              <w:rPr>
+                <w:rFonts w:cs="Arial"/>
+                <w:highlight w:val="yellow"/>
+                <w:lang w:val="en-US"/>
+                <w:sz w:val="16"/>
+                <w:szCs w:val="16"/>
+              </w:rPr>
+            </w:pPr>
+            <w:r>
+              <w:rPr>
+                <w:sz w:val="16"/>
+                <w:szCs w:val="16"/>
+              </w:rPr>
+              <w:t>{{row.qc_c}}</w:t>
+            </w:r>
+          </w:p>
+        </w:tc>
+        <w:tc>
+          <w:tcPr>
+            <w:tcW w:w="473" w:type="dxa"/>
+            <w:vAlign w:val="center"/>
+          </w:tcPr>
+          <w:p>
+            <w:pPr>
+              <w:rPr>
+                <w:rFonts w:cs="Arial"/>
+                <w:highlight w:val="yellow"/>
+                <w:lang w:val="en-US"/>
+                <w:sz w:val="16"/>
+                <w:szCs w:val="16"/>
+              </w:rPr>
+            </w:pPr>
+            <w:r>
+              <w:rPr>
+                <w:sz w:val="16"/>
+                <w:szCs w:val="16"/>
+              </w:rPr>
+              <w:t>{{row.qc_n}}</w:t>
+            </w:r>
+          </w:p>
+        </w:tc>
+        <w:tc>
+          <w:tcPr>
+            <w:tcW w:w="473" w:type="dxa"/>
+            <w:vAlign w:val="center"/>
+          </w:tcPr>
+          <w:p>
+            <w:pPr>
+              <w:rPr>
+                <w:rFonts w:cs="Arial"/>
+                <w:highlight w:val="yellow"/>
+                <w:lang w:val="en-US"/>
+                <w:sz w:val="16"/>
+                <w:szCs w:val="16"/>
+              </w:rPr>
+            </w:pPr>
+            <w:r>
+              <w:rPr>
+                <w:sz w:val="16"/>
+                <w:szCs w:val="16"/>
+              </w:rPr>
+              <w:t>{{row.qc_y}}</w:t>
+            </w:r>
+          </w:p>
+        </w:tc>
+        <w:tc>
+          <w:tcPr>
+            <w:tcW w:w="473" w:type="dxa"/>
+            <w:vAlign w:val="center"/>
+          </w:tcPr>
+          <w:p>
+            <w:pPr>
+              <w:rPr>
+                <w:rFonts w:cs="Arial"/>
+                <w:highlight w:val="yellow"/>
+                <w:lang w:val="en-US"/>
+                <w:sz w:val="16"/>
+                <w:szCs w:val="16"/>
+              </w:rPr>
+            </w:pPr>
+            <w:r>
+              <w:rPr>
+                <w:sz w:val="16"/>
+                <w:szCs w:val="16"/>
+              </w:rPr>
+              <w:t>{{row.qc_z}}</w:t>
+            </w:r>
+          </w:p>
+        </w:tc>
+        <w:tc>
+          <w:tcPr>
+            <w:tcW w:w="473" w:type="dxa"/>
+            <w:vAlign w:val="center"/>
+          </w:tcPr>
+          <w:p>
+            <w:pPr>
+              <w:rPr>
+                <w:rFonts w:cs="Arial"/>
+                <w:highlight w:val="yellow"/>
+                <w:lang w:val="en-US"/>
+                <w:sz w:val="16"/>
+                <w:szCs w:val="16"/>
+              </w:rPr>
+            </w:pPr>
+            <w:r>
+              <w:rPr>
+                <w:sz w:val="16"/>
+                <w:szCs w:val="16"/>
+              </w:rPr>
+              <w:t>{{row.qc_u}}</w:t>
+            </w:r>
+          </w:p>
+        </w:tc>
+        <w:tc>
+          <w:tcPr>
+            <w:tcW w:w="473" w:type="dxa"/>
+            <w:vAlign w:val="center"/>
+          </w:tcPr>
+          <w:p>
+            <w:pPr>
+              <w:rPr>
+                <w:rFonts w:cs="Arial"/>
+                <w:highlight w:val="yellow"/>
+                <w:lang w:val="en-US"/>
+                <w:sz w:val="16"/>
+                <w:szCs w:val="16"/>
+              </w:rPr>
+            </w:pPr>
+            <w:r>
+              <w:rPr>
+                <w:sz w:val="16"/>
+                <w:szCs w:val="16"/>
+              </w:rPr>
+              <w:t>{{row.qc_e}}</w:t>
+            </w:r>
+          </w:p>
+        </w:tc>
+        <w:tc>
+          <w:tcPr>
+            <w:tcW w:w="473" w:type="dxa"/>
+            <w:vAlign w:val="center"/>
+          </w:tcPr>
+          <w:p>
+            <w:pPr>
+              <w:rPr>
+                <w:rFonts w:cs="Arial"/>
+                <w:highlight w:val="yellow"/>
+                <w:lang w:val="en-US"/>
+                <w:sz w:val="16"/>
+                <w:szCs w:val="16"/>
+              </w:rPr>
+            </w:pPr>
+            <w:r>
+              <w:rPr>
+                <w:sz w:val="16"/>
+                <w:szCs w:val="16"/>
+              </w:rPr>
+              <w:t>{{row.qc_v}}</w:t>
+            </w:r>
+          </w:p>
+        </w:tc>
+        <w:tc>
+          <w:tcPr>
+            <w:tcW w:w="473" w:type="dxa"/>
+            <w:vAlign w:val="center"/>
+          </w:tcPr>
+          <w:p>
+            <w:pPr>
+              <w:rPr>
+                <w:rFonts w:cs="Arial"/>
+                <w:highlight w:val="yellow"/>
+                <w:lang w:val="en-US"/>
+                <w:sz w:val="16"/>
+                <w:szCs w:val="16"/>
+              </w:rPr>
+            </w:pPr>
+            <w:r>
+              <w:rPr>
+                <w:sz w:val="16"/>
+                <w:szCs w:val="16"/>
+              </w:rPr>
+              <w:t>{{row.qc_r}}</w:t>
+            </w:r>
+          </w:p>
+        </w:tc>
+        <w:tc>
+          <w:tcPr>
+            <w:tcW w:w="473" w:type="dxa"/>
+            <w:vAlign w:val="center"/>
+          </w:tcPr>
+          <w:p>
+            <w:pPr>
+              <w:rPr>
+                <w:rFonts w:cs="Arial"/>
+                <w:highlight w:val="yellow"/>
+                <w:lang w:val="en-US"/>
+                <w:sz w:val="16"/>
+                <w:szCs w:val="16"/>
+              </w:rPr>
+            </w:pPr>
+            <w:r>
+              <w:rPr>
+                <w:sz w:val="16"/>
+                <w:szCs w:val="16"/>
+              </w:rPr>
+              <w:t>{{row.qc_d}}</w:t>
             </w:r>
           </w:p>
         </w:tc>
@@ -2051,7 +2899,7 @@
     </w:p>
     <w:sectPr>
       <w:headerReference w:type="first" r:id="rId19"/>
-      <w:pgSz w:w="11906" w:h="16838"/>
+      <w:pgSz w:w="16838" w:h="11906" w:orient="landscape"/>
       <w:pgMar w:top="1134" w:right="1134" w:bottom="1134" w:left="1418" w:header="720" w:footer="720" w:gutter="0"/>
       <w:cols w:space="0"/>
       <w:titlePg/>

</xml_diff>